<commit_message>
Use additive period effects across AFRI mixed models
</commit_message>
<xml_diff>
--- a/AFRI_Variables_Models_and_Datasets.docx
+++ b/AFRI_Variables_Models_and_Datasets.docx
@@ -16,7 +16,20 @@
         <w:pStyle w:val="FirstParagraph"/>
       </w:pPr>
       <w:r>
-        <w:t xml:space="preserve">Yes. I updated the</w:t>
+        <w:t xml:space="preserve">This document lists the current AFRI variables, models, and datasets using the requested</w:t>
+      </w:r>
+      <w:r>
+        <w:t xml:space="preserve"> </w:t>
+      </w:r>
+      <w:r>
+        <w:rPr>
+          <w:b/>
+          <w:bCs/>
+        </w:rPr>
+        <w:t xml:space="preserve">additive-period model specifications</w:t>
+      </w:r>
+      <w:r>
+        <w:t xml:space="preserve">. The</w:t>
       </w:r>
       <w:r>
         <w:t xml:space="preserve"> </w:t>
@@ -26,11 +39,14 @@
           <w:rPr>
             <w:rStyle w:val="Hyperlink"/>
           </w:rPr>
-          <w:t xml:space="preserve">complete list on GitHub</w:t>
+          <w:t xml:space="preserve">complete catalog on GitHub</w:t>
         </w:r>
       </w:hyperlink>
       <w:r>
-        <w:t xml:space="preserve">, including the</w:t>
+        <w:t xml:space="preserve"> </w:t>
+      </w:r>
+      <w:r>
+        <w:t xml:space="preserve">includes the</w:t>
       </w:r>
       <w:r>
         <w:t xml:space="preserve"> </w:t>
@@ -140,7 +156,7 @@
         <w:rPr>
           <w:rStyle w:val="VerbatimChar"/>
         </w:rPr>
-        <w:t xml:space="preserve">response ~ TRT * SR * Period + (1 | Year) + (1 | Pasture)</w:t>
+        <w:t xml:space="preserve">response ~ TRT * SR + Period + (1 | Year) + (1 | Pasture)</w:t>
       </w:r>
       <w:r>
         <w:br/>
@@ -161,7 +177,7 @@
         <w:rPr>
           <w:rStyle w:val="VerbatimChar"/>
         </w:rPr>
-        <w:t xml:space="preserve">response ~ TRT * SR * Period + (1 | Year) + (1 | Pasture)</w:t>
+        <w:t xml:space="preserve">response ~ TRT * SR + Period + (1 | Year) + (1 | Pasture)</w:t>
       </w:r>
       <w:r>
         <w:br/>
@@ -182,7 +198,7 @@
         <w:rPr>
           <w:rStyle w:val="VerbatimChar"/>
         </w:rPr>
-        <w:t xml:space="preserve">response ~ TRT * SR * RotationPeriod + (1 | Year) + (1 | Pasture)</w:t>
+        <w:t xml:space="preserve">response ~ TRT * SR + RotationPeriod + (1 | Year) + (1 | Pasture)</w:t>
       </w:r>
       <w:r>
         <w:br/>
@@ -224,12 +240,86 @@
         <w:rPr>
           <w:rStyle w:val="VerbatimChar"/>
         </w:rPr>
-        <w:t xml:space="preserve">response ~ TRT * SR * Period + (1 | Year) + (1 | Pasture)</w:t>
+        <w:t xml:space="preserve">response ~ TRT * SR + Period + (1 | Year) + (1 | Pasture)</w:t>
       </w:r>
     </w:p>
     <w:p>
       <w:pPr>
         <w:pStyle w:val="FirstParagraph"/>
+      </w:pPr>
+      <w:r>
+        <w:t xml:space="preserve">The period models retain</w:t>
+      </w:r>
+      <w:r>
+        <w:t xml:space="preserve"> </w:t>
+      </w:r>
+      <w:r>
+        <w:rPr>
+          <w:rStyle w:val="VerbatimChar"/>
+        </w:rPr>
+        <w:t xml:space="preserve">TRT</w:t>
+      </w:r>
+      <w:r>
+        <w:t xml:space="preserve">,</w:t>
+      </w:r>
+      <w:r>
+        <w:t xml:space="preserve"> </w:t>
+      </w:r>
+      <w:r>
+        <w:rPr>
+          <w:rStyle w:val="VerbatimChar"/>
+        </w:rPr>
+        <w:t xml:space="preserve">SR</w:t>
+      </w:r>
+      <w:r>
+        <w:t xml:space="preserve">, and</w:t>
+      </w:r>
+      <w:r>
+        <w:t xml:space="preserve"> </w:t>
+      </w:r>
+      <w:r>
+        <w:rPr>
+          <w:rStyle w:val="VerbatimChar"/>
+        </w:rPr>
+        <w:t xml:space="preserve">TRT:SR</w:t>
+      </w:r>
+      <w:r>
+        <w:t xml:space="preserve">, and add</w:t>
+      </w:r>
+      <w:r>
+        <w:t xml:space="preserve"> </w:t>
+      </w:r>
+      <w:r>
+        <w:rPr>
+          <w:rStyle w:val="VerbatimChar"/>
+        </w:rPr>
+        <w:t xml:space="preserve">Period</w:t>
+      </w:r>
+      <w:r>
+        <w:t xml:space="preserve"> </w:t>
+      </w:r>
+      <w:r>
+        <w:t xml:space="preserve">or</w:t>
+      </w:r>
+      <w:r>
+        <w:t xml:space="preserve"> </w:t>
+      </w:r>
+      <w:r>
+        <w:rPr>
+          <w:rStyle w:val="VerbatimChar"/>
+        </w:rPr>
+        <w:t xml:space="preserve">RotationPeriod</w:t>
+      </w:r>
+      <w:r>
+        <w:t xml:space="preserve"> </w:t>
+      </w:r>
+      <w:r>
+        <w:t xml:space="preserve">as a fixed main effect. They contain no interactions between treatment or stocking rate and period. The baseline S model and final-weight ANCOVA C model are unchanged.</w:t>
+      </w:r>
+    </w:p>
+    <w:p>
+      <w:pPr>
+        <w:pStyle w:val="BodyText"/>
       </w:pPr>
       <w:r>
         <w:t xml:space="preserve">Some retained source models use</w:t>
@@ -7726,19 +7816,7 @@
         <w:pStyle w:val="BodyText"/>
       </w:pPr>
       <w:r>
-        <w:t xml:space="preserve">This list was checked against the current code and published in commit</w:t>
-      </w:r>
-      <w:r>
-        <w:t xml:space="preserve"> </w:t>
-      </w:r>
-      <w:r>
-        <w:rPr>
-          <w:rStyle w:val="VerbatimChar"/>
-        </w:rPr>
-        <w:t xml:space="preserve">7f1e073</w:t>
-      </w:r>
-      <w:r>
-        <w:t xml:space="preserve">.</w:t>
+        <w:t xml:space="preserve">This inventory reflects the current requested additive-period models.</w:t>
       </w:r>
       <w:r>
         <w:t xml:space="preserve"> </w:t>

</xml_diff>

<commit_message>
Remove combined-gas outcomes and reorganize statistical workbook
</commit_message>
<xml_diff>
--- a/AFRI_Variables_Models_and_Datasets.docx
+++ b/AFRI_Variables_Models_and_Datasets.docx
@@ -91,7 +91,7 @@
           <w:b/>
           <w:bCs/>
         </w:rPr>
-        <w:t xml:space="preserve">62 reporting, source, and conditional entries</w:t>
+        <w:t xml:space="preserve">57 reporting, source, and conditional entries</w:t>
       </w:r>
       <w:r>
         <w:t xml:space="preserve">. Reused entries share an existing fitted model. Dataset names below refer to</w:t>
@@ -377,6 +377,269 @@
       </w:r>
       <w:r>
         <w:t xml:space="preserve">. The linked catalog gives each literal formula.</w:t>
+      </w:r>
+    </w:p>
+    <w:p>
+      <w:pPr>
+        <w:pStyle w:val="BodyText"/>
+        <w:keepNext/>
+      </w:pPr>
+      <w:r>
+        <w:rPr>
+          <w:b/>
+          <w:bCs/>
+        </w:rPr>
+        <w:t xml:space="preserve">Statistical workbook organization</w:t>
+      </w:r>
+    </w:p>
+    <w:p>
+      <w:pPr>
+        <w:pStyle w:val="BodyText"/>
+      </w:pPr>
+      <w:r>
+        <w:t xml:space="preserve">The first worksheet of</w:t>
+      </w:r>
+      <w:r>
+        <w:t xml:space="preserve"> </w:t>
+      </w:r>
+      <w:r>
+        <w:rPr>
+          <w:rStyle w:val="VerbatimChar"/>
+        </w:rPr>
+        <w:t xml:space="preserve">AFRI_Statistical_Results.xlsx</w:t>
+      </w:r>
+      <w:r>
+        <w:t xml:space="preserve"> </w:t>
+      </w:r>
+      <w:r>
+        <w:t xml:space="preserve">is the preserved</w:t>
+      </w:r>
+      <w:r>
+        <w:t xml:space="preserve"> </w:t>
+      </w:r>
+      <w:r>
+        <w:rPr>
+          <w:rStyle w:val="VerbatimChar"/>
+        </w:rPr>
+        <w:t xml:space="preserve">Table_1_Grazing_Behaviors</w:t>
+      </w:r>
+      <w:r>
+        <w:t xml:space="preserve"> </w:t>
+      </w:r>
+      <w:r>
+        <w:t xml:space="preserve">table.</w:t>
+      </w:r>
+      <w:r>
+        <w:t xml:space="preserve"> </w:t>
+      </w:r>
+      <w:r>
+        <w:rPr>
+          <w:rStyle w:val="VerbatimChar"/>
+        </w:rPr>
+        <w:t xml:space="preserve">Table2</w:t>
+      </w:r>
+      <w:r>
+        <w:t xml:space="preserve"> </w:t>
+      </w:r>
+      <w:r>
+        <w:t xml:space="preserve">contains the animal-level whole-season BW, growth, and gas responses, including all three variables formerly in</w:t>
+      </w:r>
+      <w:r>
+        <w:t xml:space="preserve"> </w:t>
+      </w:r>
+      <w:r>
+        <w:rPr>
+          <w:rStyle w:val="VerbatimChar"/>
+        </w:rPr>
+        <w:t xml:space="preserve">ShrunkBW_Season</w:t>
+      </w:r>
+      <w:r>
+        <w:t xml:space="preserve">:</w:t>
+      </w:r>
+      <w:r>
+        <w:t xml:space="preserve"> </w:t>
+      </w:r>
+      <w:r>
+        <w:rPr>
+          <w:rStyle w:val="VerbatimChar"/>
+        </w:rPr>
+        <w:t xml:space="preserve">Whole_Season_CH4_g_day</w:t>
+      </w:r>
+      <w:r>
+        <w:t xml:space="preserve">,</w:t>
+      </w:r>
+      <w:r>
+        <w:t xml:space="preserve"> </w:t>
+      </w:r>
+      <w:r>
+        <w:rPr>
+          <w:rStyle w:val="VerbatimChar"/>
+        </w:rPr>
+        <w:t xml:space="preserve">Whole_Season_CO2_g_day</w:t>
+      </w:r>
+      <w:r>
+        <w:t xml:space="preserve">, and</w:t>
+      </w:r>
+      <w:r>
+        <w:t xml:space="preserve"> </w:t>
+      </w:r>
+      <w:r>
+        <w:rPr>
+          <w:rStyle w:val="VerbatimChar"/>
+        </w:rPr>
+        <w:t xml:space="preserve">Whole_Season_Smooth_ADG_kg_day</w:t>
+      </w:r>
+      <w:r>
+        <w:t xml:space="preserve">. The</w:t>
+      </w:r>
+      <w:r>
+        <w:t xml:space="preserve"> </w:t>
+      </w:r>
+      <w:r>
+        <w:rPr>
+          <w:rStyle w:val="VerbatimChar"/>
+        </w:rPr>
+        <w:t xml:space="preserve">ShrunkBW_Season</w:t>
+      </w:r>
+      <w:r>
+        <w:t xml:space="preserve"> </w:t>
+      </w:r>
+      <w:r>
+        <w:t xml:space="preserve">worksheet is removed.</w:t>
+      </w:r>
+    </w:p>
+    <w:p>
+      <w:pPr>
+        <w:pStyle w:val="BodyText"/>
+      </w:pPr>
+      <w:r>
+        <w:rPr>
+          <w:rStyle w:val="VerbatimChar"/>
+        </w:rPr>
+        <w:t xml:space="preserve">WholeSeason_Additional</w:t>
+      </w:r>
+      <w:r>
+        <w:t xml:space="preserve"> </w:t>
+      </w:r>
+      <w:r>
+        <w:t xml:space="preserve">contains all retained whole-season pasture responses, including the four transferred variables:</w:t>
+      </w:r>
+      <w:r>
+        <w:t xml:space="preserve"> </w:t>
+      </w:r>
+      <w:r>
+        <w:rPr>
+          <w:rStyle w:val="VerbatimChar"/>
+        </w:rPr>
+        <w:t xml:space="preserve">CH4_g_per_active_ha_whole_season</w:t>
+      </w:r>
+      <w:r>
+        <w:t xml:space="preserve">,</w:t>
+      </w:r>
+      <w:r>
+        <w:t xml:space="preserve"> </w:t>
+      </w:r>
+      <w:r>
+        <w:rPr>
+          <w:rStyle w:val="VerbatimChar"/>
+        </w:rPr>
+        <w:t xml:space="preserve">CO2_g_per_active_ha_whole_season</w:t>
+      </w:r>
+      <w:r>
+        <w:t xml:space="preserve">,</w:t>
+      </w:r>
+      <w:r>
+        <w:t xml:space="preserve"> </w:t>
+      </w:r>
+      <w:r>
+        <w:rPr>
+          <w:rStyle w:val="VerbatimChar"/>
+        </w:rPr>
+        <w:t xml:space="preserve">active_ha_whole_season</w:t>
+      </w:r>
+      <w:r>
+        <w:t xml:space="preserve">, and</w:t>
+      </w:r>
+      <w:r>
+        <w:t xml:space="preserve"> </w:t>
+      </w:r>
+      <w:r>
+        <w:rPr>
+          <w:rStyle w:val="VerbatimChar"/>
+        </w:rPr>
+        <w:t xml:space="preserve">LWG_kg_per_active_ha_whole_season</w:t>
+      </w:r>
+      <w:r>
+        <w:t xml:space="preserve">. The last variable is season-total LWG per active hectare;</w:t>
+      </w:r>
+      <w:r>
+        <w:t xml:space="preserve"> </w:t>
+      </w:r>
+      <w:r>
+        <w:rPr>
+          <w:rStyle w:val="VerbatimChar"/>
+        </w:rPr>
+        <w:t xml:space="preserve">ADG_Land_kg_per_active_ha_day_whole_season</w:t>
+      </w:r>
+      <w:r>
+        <w:t xml:space="preserve"> </w:t>
+      </w:r>
+      <w:r>
+        <w:t xml:space="preserve">remains a distinct daily land-rate response. Period outputs are in</w:t>
+      </w:r>
+      <w:r>
+        <w:t xml:space="preserve"> </w:t>
+      </w:r>
+      <w:r>
+        <w:rPr>
+          <w:rStyle w:val="VerbatimChar"/>
+        </w:rPr>
+        <w:t xml:space="preserve">Pasture_RGP</w:t>
+      </w:r>
+      <w:r>
+        <w:t xml:space="preserve"> </w:t>
+      </w:r>
+      <w:r>
+        <w:t xml:space="preserve">and</w:t>
+      </w:r>
+      <w:r>
+        <w:t xml:space="preserve"> </w:t>
+      </w:r>
+      <w:r>
+        <w:rPr>
+          <w:rStyle w:val="VerbatimChar"/>
+        </w:rPr>
+        <w:t xml:space="preserve">Animal_RGP</w:t>
+      </w:r>
+      <w:r>
+        <w:t xml:space="preserve">. Table 1 is exported once in this workbook; there is no second standalone copy. Its cached EMMs and letters remain in the raw-result sheets, and</w:t>
+      </w:r>
+      <w:r>
+        <w:t xml:space="preserve"> </w:t>
+      </w:r>
+      <w:r>
+        <w:rPr>
+          <w:rStyle w:val="VerbatimChar"/>
+        </w:rPr>
+        <w:t xml:space="preserve">Table1_Reference_ANOVA</w:t>
+      </w:r>
+      <w:r>
+        <w:t xml:space="preserve"> </w:t>
+      </w:r>
+      <w:r>
+        <w:t xml:space="preserve">preserves the complete original Type III ANOVA rows and columns; the same behavior tests are not repeated in</w:t>
+      </w:r>
+      <w:r>
+        <w:t xml:space="preserve"> </w:t>
+      </w:r>
+      <w:r>
+        <w:rPr>
+          <w:rStyle w:val="VerbatimChar"/>
+        </w:rPr>
+        <w:t xml:space="preserve">Fixed_Effect_Omnibus</w:t>
+      </w:r>
+      <w:r>
+        <w:t xml:space="preserve">. The source analysis keys, fitting datasets, and retained formulas are unchanged.</w:t>
       </w:r>
     </w:p>
     <w:p>
@@ -4113,7 +4376,7 @@
                 <w:rStyle w:val="VerbatimChar"/>
                 <w:sz w:val="19"/>
               </w:rPr>
-              <w:t xml:space="preserve">GHG_g_per_active_ha_all_pasture</w:t>
+              <w:t xml:space="preserve">CH4_g_per_kg_LWG</w:t>
             </w:r>
           </w:p>
         </w:tc>
@@ -4196,7 +4459,7 @@
                 <w:rStyle w:val="VerbatimChar"/>
                 <w:sz w:val="19"/>
               </w:rPr>
-              <w:t xml:space="preserve">GHG_g_per_active_ha_inside_rgp</w:t>
+              <w:t xml:space="preserve">CO2_g_per_kg_LWG</w:t>
             </w:r>
           </w:p>
         </w:tc>
@@ -4234,255 +4497,6 @@
               <w:left w:w="70" w:type="dxa"/>
               <w:right w:w="70" w:type="dxa"/>
             </w:tcMar>
-          </w:tcPr>
-          <w:p>
-            <w:pPr>
-              <w:pStyle w:val="Compact"/>
-              <w:keepNext w:val="0"/>
-              <w:spacing w:after="40" w:line="240" w:lineRule="auto"/>
-              <w:jc w:val="left"/>
-            </w:pPr>
-            <w:r>
-              <w:rPr>
-                <w:sz w:val="19"/>
-              </w:rPr>
-              <w:t xml:space="preserve">Same period dataset</w:t>
-            </w:r>
-          </w:p>
-        </w:tc>
-      </w:tr>
-      <w:tr>
-        <w:trPr>
-          <w:cantSplit/>
-        </w:trPr>
-        <w:tc>
-          <w:tcPr>
-            <w:tcW w:type="dxa" w:w="5645"/>
-            <w:tcMar>
-              <w:top w:w="70" w:type="dxa"/>
-              <w:bottom w:w="70" w:type="dxa"/>
-              <w:left w:w="70" w:type="dxa"/>
-              <w:right w:w="70" w:type="dxa"/>
-            </w:tcMar>
-            <w:shd w:fill="F2F5F9" w:val="clear"/>
-          </w:tcPr>
-          <w:p>
-            <w:pPr>
-              <w:pStyle w:val="Compact"/>
-              <w:keepNext w:val="0"/>
-              <w:spacing w:after="40" w:line="240" w:lineRule="auto"/>
-              <w:jc w:val="left"/>
-            </w:pPr>
-            <w:r>
-              <w:rPr>
-                <w:rStyle w:val="VerbatimChar"/>
-                <w:sz w:val="19"/>
-              </w:rPr>
-              <w:t xml:space="preserve">CH4_g_per_kg_LWG</w:t>
-            </w:r>
-          </w:p>
-        </w:tc>
-        <w:tc>
-          <w:tcPr>
-            <w:tcW w:type="dxa" w:w="2540"/>
-            <w:tcMar>
-              <w:top w:w="70" w:type="dxa"/>
-              <w:bottom w:w="70" w:type="dxa"/>
-              <w:left w:w="70" w:type="dxa"/>
-              <w:right w:w="70" w:type="dxa"/>
-            </w:tcMar>
-            <w:shd w:fill="F2F5F9" w:val="clear"/>
-          </w:tcPr>
-          <w:p>
-            <w:pPr>
-              <w:pStyle w:val="Compact"/>
-              <w:keepNext w:val="0"/>
-              <w:spacing w:after="40" w:line="240" w:lineRule="auto"/>
-              <w:jc w:val="left"/>
-            </w:pPr>
-            <w:r>
-              <w:rPr>
-                <w:sz w:val="19"/>
-              </w:rPr>
-              <w:t xml:space="preserve">P</w:t>
-            </w:r>
-          </w:p>
-        </w:tc>
-        <w:tc>
-          <w:tcPr>
-            <w:tcW w:type="dxa" w:w="5927"/>
-            <w:tcMar>
-              <w:top w:w="70" w:type="dxa"/>
-              <w:bottom w:w="70" w:type="dxa"/>
-              <w:left w:w="70" w:type="dxa"/>
-              <w:right w:w="70" w:type="dxa"/>
-            </w:tcMar>
-            <w:shd w:fill="F2F5F9" w:val="clear"/>
-          </w:tcPr>
-          <w:p>
-            <w:pPr>
-              <w:pStyle w:val="Compact"/>
-              <w:keepNext w:val="0"/>
-              <w:spacing w:after="40" w:line="240" w:lineRule="auto"/>
-              <w:jc w:val="left"/>
-            </w:pPr>
-            <w:r>
-              <w:rPr>
-                <w:sz w:val="19"/>
-              </w:rPr>
-              <w:t xml:space="preserve">Same period dataset</w:t>
-            </w:r>
-          </w:p>
-        </w:tc>
-      </w:tr>
-      <w:tr>
-        <w:trPr>
-          <w:cantSplit/>
-        </w:trPr>
-        <w:tc>
-          <w:tcPr>
-            <w:tcW w:type="dxa" w:w="5645"/>
-            <w:tcMar>
-              <w:top w:w="70" w:type="dxa"/>
-              <w:bottom w:w="70" w:type="dxa"/>
-              <w:left w:w="70" w:type="dxa"/>
-              <w:right w:w="70" w:type="dxa"/>
-            </w:tcMar>
-          </w:tcPr>
-          <w:p>
-            <w:pPr>
-              <w:pStyle w:val="Compact"/>
-              <w:keepNext w:val="0"/>
-              <w:spacing w:after="40" w:line="240" w:lineRule="auto"/>
-              <w:jc w:val="left"/>
-            </w:pPr>
-            <w:r>
-              <w:rPr>
-                <w:rStyle w:val="VerbatimChar"/>
-                <w:sz w:val="19"/>
-              </w:rPr>
-              <w:t xml:space="preserve">CO2_g_per_kg_LWG</w:t>
-            </w:r>
-          </w:p>
-        </w:tc>
-        <w:tc>
-          <w:tcPr>
-            <w:tcW w:type="dxa" w:w="2540"/>
-            <w:tcMar>
-              <w:top w:w="70" w:type="dxa"/>
-              <w:bottom w:w="70" w:type="dxa"/>
-              <w:left w:w="70" w:type="dxa"/>
-              <w:right w:w="70" w:type="dxa"/>
-            </w:tcMar>
-          </w:tcPr>
-          <w:p>
-            <w:pPr>
-              <w:pStyle w:val="Compact"/>
-              <w:keepNext w:val="0"/>
-              <w:spacing w:after="40" w:line="240" w:lineRule="auto"/>
-              <w:jc w:val="left"/>
-            </w:pPr>
-            <w:r>
-              <w:rPr>
-                <w:sz w:val="19"/>
-              </w:rPr>
-              <w:t xml:space="preserve">P</w:t>
-            </w:r>
-          </w:p>
-        </w:tc>
-        <w:tc>
-          <w:tcPr>
-            <w:tcW w:type="dxa" w:w="5927"/>
-            <w:tcMar>
-              <w:top w:w="70" w:type="dxa"/>
-              <w:bottom w:w="70" w:type="dxa"/>
-              <w:left w:w="70" w:type="dxa"/>
-              <w:right w:w="70" w:type="dxa"/>
-            </w:tcMar>
-          </w:tcPr>
-          <w:p>
-            <w:pPr>
-              <w:pStyle w:val="Compact"/>
-              <w:keepNext w:val="0"/>
-              <w:spacing w:after="40" w:line="240" w:lineRule="auto"/>
-              <w:jc w:val="left"/>
-            </w:pPr>
-            <w:r>
-              <w:rPr>
-                <w:sz w:val="19"/>
-              </w:rPr>
-              <w:t xml:space="preserve">Same period dataset</w:t>
-            </w:r>
-          </w:p>
-        </w:tc>
-      </w:tr>
-      <w:tr>
-        <w:trPr>
-          <w:cantSplit/>
-        </w:trPr>
-        <w:tc>
-          <w:tcPr>
-            <w:tcW w:type="dxa" w:w="5645"/>
-            <w:tcMar>
-              <w:top w:w="70" w:type="dxa"/>
-              <w:bottom w:w="70" w:type="dxa"/>
-              <w:left w:w="70" w:type="dxa"/>
-              <w:right w:w="70" w:type="dxa"/>
-            </w:tcMar>
-            <w:shd w:fill="F2F5F9" w:val="clear"/>
-          </w:tcPr>
-          <w:p>
-            <w:pPr>
-              <w:pStyle w:val="Compact"/>
-              <w:keepNext w:val="0"/>
-              <w:spacing w:after="40" w:line="240" w:lineRule="auto"/>
-              <w:jc w:val="left"/>
-            </w:pPr>
-            <w:r>
-              <w:rPr>
-                <w:rStyle w:val="VerbatimChar"/>
-                <w:sz w:val="19"/>
-              </w:rPr>
-              <w:t xml:space="preserve">GHG_g_per_kg_LWG</w:t>
-            </w:r>
-          </w:p>
-        </w:tc>
-        <w:tc>
-          <w:tcPr>
-            <w:tcW w:type="dxa" w:w="2540"/>
-            <w:tcMar>
-              <w:top w:w="70" w:type="dxa"/>
-              <w:bottom w:w="70" w:type="dxa"/>
-              <w:left w:w="70" w:type="dxa"/>
-              <w:right w:w="70" w:type="dxa"/>
-            </w:tcMar>
-            <w:shd w:fill="F2F5F9" w:val="clear"/>
-          </w:tcPr>
-          <w:p>
-            <w:pPr>
-              <w:pStyle w:val="Compact"/>
-              <w:keepNext w:val="0"/>
-              <w:spacing w:after="40" w:line="240" w:lineRule="auto"/>
-              <w:jc w:val="left"/>
-            </w:pPr>
-            <w:r>
-              <w:rPr>
-                <w:sz w:val="19"/>
-              </w:rPr>
-              <w:t xml:space="preserve">P</w:t>
-            </w:r>
-          </w:p>
-        </w:tc>
-        <w:tc>
-          <w:tcPr>
-            <w:tcW w:type="dxa" w:w="5927"/>
-            <w:tcMar>
-              <w:top w:w="70" w:type="dxa"/>
-              <w:bottom w:w="70" w:type="dxa"/>
-              <w:left w:w="70" w:type="dxa"/>
-              <w:right w:w="70" w:type="dxa"/>
-            </w:tcMar>
-            <w:shd w:fill="F2F5F9" w:val="clear"/>
           </w:tcPr>
           <w:p>
             <w:pPr>
@@ -5457,7 +5471,7 @@
                 <w:rStyle w:val="VerbatimChar"/>
                 <w:sz w:val="19"/>
               </w:rPr>
-              <w:t xml:space="preserve">GHG_g_per_active_ha_whole_season</w:t>
+              <w:t xml:space="preserve">CH4_g_per_kg_LWG_whole_season</w:t>
             </w:r>
           </w:p>
         </w:tc>
@@ -5514,121 +5528,7 @@
                 <w:rStyle w:val="VerbatimChar"/>
                 <w:sz w:val="19"/>
               </w:rPr>
-              <w:t xml:space="preserve">CH4_g_per_kg_LWG_whole_season</w:t>
-            </w:r>
-          </w:p>
-        </w:tc>
-        <w:tc>
-          <w:tcPr>
-            <w:tcW w:type="dxa" w:w="2258"/>
-            <w:tcMar>
-              <w:top w:w="70" w:type="dxa"/>
-              <w:bottom w:w="70" w:type="dxa"/>
-              <w:left w:w="70" w:type="dxa"/>
-              <w:right w:w="70" w:type="dxa"/>
-            </w:tcMar>
-          </w:tcPr>
-          <w:p>
-            <w:pPr>
-              <w:pStyle w:val="Compact"/>
-              <w:keepNext w:val="0"/>
-              <w:spacing w:after="40" w:line="240" w:lineRule="auto"/>
-              <w:jc w:val="left"/>
-            </w:pPr>
-            <w:r>
-              <w:rPr>
-                <w:sz w:val="19"/>
-              </w:rPr>
-              <w:t xml:space="preserve">S</w:t>
-            </w:r>
-          </w:p>
-        </w:tc>
-      </w:tr>
-      <w:tr>
-        <w:trPr>
-          <w:cantSplit/>
-        </w:trPr>
-        <w:tc>
-          <w:tcPr>
-            <w:tcW w:type="dxa" w:w="11854"/>
-            <w:tcMar>
-              <w:top w:w="70" w:type="dxa"/>
-              <w:bottom w:w="70" w:type="dxa"/>
-              <w:left w:w="70" w:type="dxa"/>
-              <w:right w:w="70" w:type="dxa"/>
-            </w:tcMar>
-            <w:shd w:fill="F2F5F9" w:val="clear"/>
-          </w:tcPr>
-          <w:p>
-            <w:pPr>
-              <w:pStyle w:val="Compact"/>
-              <w:keepNext w:val="0"/>
-              <w:spacing w:after="40" w:line="240" w:lineRule="auto"/>
-              <w:jc w:val="left"/>
-            </w:pPr>
-            <w:r>
-              <w:rPr>
-                <w:rStyle w:val="VerbatimChar"/>
-                <w:sz w:val="19"/>
-              </w:rPr>
               <w:t xml:space="preserve">CO2_g_per_kg_LWG_whole_season</w:t>
-            </w:r>
-          </w:p>
-        </w:tc>
-        <w:tc>
-          <w:tcPr>
-            <w:tcW w:type="dxa" w:w="2258"/>
-            <w:tcMar>
-              <w:top w:w="70" w:type="dxa"/>
-              <w:bottom w:w="70" w:type="dxa"/>
-              <w:left w:w="70" w:type="dxa"/>
-              <w:right w:w="70" w:type="dxa"/>
-            </w:tcMar>
-            <w:shd w:fill="F2F5F9" w:val="clear"/>
-          </w:tcPr>
-          <w:p>
-            <w:pPr>
-              <w:pStyle w:val="Compact"/>
-              <w:keepNext w:val="0"/>
-              <w:spacing w:after="40" w:line="240" w:lineRule="auto"/>
-              <w:jc w:val="left"/>
-            </w:pPr>
-            <w:r>
-              <w:rPr>
-                <w:sz w:val="19"/>
-              </w:rPr>
-              <w:t xml:space="preserve">S</w:t>
-            </w:r>
-          </w:p>
-        </w:tc>
-      </w:tr>
-      <w:tr>
-        <w:trPr>
-          <w:cantSplit/>
-        </w:trPr>
-        <w:tc>
-          <w:tcPr>
-            <w:tcW w:type="dxa" w:w="11854"/>
-            <w:tcMar>
-              <w:top w:w="70" w:type="dxa"/>
-              <w:bottom w:w="70" w:type="dxa"/>
-              <w:left w:w="70" w:type="dxa"/>
-              <w:right w:w="70" w:type="dxa"/>
-            </w:tcMar>
-          </w:tcPr>
-          <w:p>
-            <w:pPr>
-              <w:pStyle w:val="Compact"/>
-              <w:keepNext w:val="0"/>
-              <w:spacing w:after="40" w:line="240" w:lineRule="auto"/>
-              <w:jc w:val="left"/>
-            </w:pPr>
-            <w:r>
-              <w:rPr>
-                <w:rStyle w:val="VerbatimChar"/>
-                <w:sz w:val="19"/>
-              </w:rPr>
-              <w:t xml:space="preserve">GHG_g_per_kg_LWG_whole_season</w:t>
             </w:r>
           </w:p>
         </w:tc>
@@ -7793,22 +7693,7 @@
         <w:pStyle w:val="BodyText"/>
       </w:pPr>
       <w:r>
-        <w:t xml:space="preserve">GPS coverage, GreenFeed sampling counts, spatial classifications, and diagnostic quantities are additional QC outputs. Variables named</w:t>
-      </w:r>
-      <w:r>
-        <w:t xml:space="preserve"> </w:t>
-      </w:r>
-      <w:r>
-        <w:rPr>
-          <w:rStyle w:val="VerbatimChar"/>
-        </w:rPr>
-        <w:t xml:space="preserve">GHG</w:t>
-      </w:r>
-      <w:r>
-        <w:t xml:space="preserve"> </w:t>
-      </w:r>
-      <w:r>
-        <w:t xml:space="preserve">combine CH₄ and CO₂ mass; they are not CO₂-equivalent values.</w:t>
+        <w:t xml:space="preserve">GPS coverage, GreenFeed sampling counts, spatial classifications, and diagnostic quantities are additional QC outputs. The separate CH₄ and CO₂ responses remain; combined CH₄ + CO₂ totals, land-area ratios, liveweight-gain intensities, and associated models were removed at your request.</w:t>
       </w:r>
     </w:p>
     <w:p>

</xml_diff>

<commit_message>
Remove outside assigned RGP active-area calculation and model
</commit_message>
<xml_diff>
--- a/AFRI_Variables_Models_and_Datasets.docx
+++ b/AFRI_Variables_Models_and_Datasets.docx
@@ -91,7 +91,7 @@
           <w:b/>
           <w:bCs/>
         </w:rPr>
-        <w:t xml:space="preserve">57 reporting, source, and conditional entries</w:t>
+        <w:t xml:space="preserve">56 reporting, source, and conditional entries</w:t>
       </w:r>
       <w:r>
         <w:t xml:space="preserve">. Reused entries share an existing fitted model. Dataset names below refer to</w:t>
@@ -3412,88 +3412,6 @@
                 <w:sz w:val="19"/>
               </w:rPr>
               <w:t xml:space="preserve">, inside-RGP grid</w:t>
-            </w:r>
-          </w:p>
-        </w:tc>
-      </w:tr>
-      <w:tr>
-        <w:trPr>
-          <w:cantSplit/>
-        </w:trPr>
-        <w:tc>
-          <w:tcPr>
-            <w:tcW w:type="dxa" w:w="5645"/>
-            <w:tcMar>
-              <w:top w:w="70" w:type="dxa"/>
-              <w:bottom w:w="70" w:type="dxa"/>
-              <w:left w:w="70" w:type="dxa"/>
-              <w:right w:w="70" w:type="dxa"/>
-            </w:tcMar>
-          </w:tcPr>
-          <w:p>
-            <w:pPr>
-              <w:pStyle w:val="Compact"/>
-              <w:keepNext w:val="0"/>
-              <w:spacing w:after="40" w:line="240" w:lineRule="auto"/>
-              <w:jc w:val="left"/>
-            </w:pPr>
-            <w:r>
-              <w:rPr>
-                <w:rStyle w:val="VerbatimChar"/>
-                <w:sz w:val="19"/>
-              </w:rPr>
-              <w:t xml:space="preserve">active_ha_outside_rgp</w:t>
-            </w:r>
-          </w:p>
-        </w:tc>
-        <w:tc>
-          <w:tcPr>
-            <w:tcW w:type="dxa" w:w="2540"/>
-            <w:tcMar>
-              <w:top w:w="70" w:type="dxa"/>
-              <w:bottom w:w="70" w:type="dxa"/>
-              <w:left w:w="70" w:type="dxa"/>
-              <w:right w:w="70" w:type="dxa"/>
-            </w:tcMar>
-          </w:tcPr>
-          <w:p>
-            <w:pPr>
-              <w:pStyle w:val="Compact"/>
-              <w:keepNext w:val="0"/>
-              <w:spacing w:after="40" w:line="240" w:lineRule="auto"/>
-              <w:jc w:val="left"/>
-            </w:pPr>
-            <w:r>
-              <w:rPr>
-                <w:sz w:val="19"/>
-              </w:rPr>
-              <w:t xml:space="preserve">P</w:t>
-            </w:r>
-          </w:p>
-        </w:tc>
-        <w:tc>
-          <w:tcPr>
-            <w:tcW w:type="dxa" w:w="5927"/>
-            <w:tcMar>
-              <w:top w:w="70" w:type="dxa"/>
-              <w:bottom w:w="70" w:type="dxa"/>
-              <w:left w:w="70" w:type="dxa"/>
-              <w:right w:w="70" w:type="dxa"/>
-            </w:tcMar>
-          </w:tcPr>
-          <w:p>
-            <w:pPr>
-              <w:pStyle w:val="Compact"/>
-              <w:keepNext w:val="0"/>
-              <w:spacing w:after="40" w:line="240" w:lineRule="auto"/>
-              <w:jc w:val="left"/>
-            </w:pPr>
-            <w:r>
-              <w:rPr>
-                <w:rStyle w:val="VerbatimChar"/>
-                <w:sz w:val="19"/>
-              </w:rPr>
-              <w:t xml:space="preserve">period_level_grazing_productivity</w:t>
             </w:r>
           </w:p>
         </w:tc>

</xml_diff>